<commit_message>
Workflow: no-brand rule, remove disclaimers, straight-to-the-point writing
- Brand name banned from all article body text; risk disclaimer and author
  block removed (CMS-injected); [FTMO platform knowledge] → [platform knowledge]
- ToV guide: new "Straight to the Point" section with banned filler constructions
- Write workflow: No Filler section in Step 3, filler check added to Step 4
- Lesson outputs: timeframe-hierarchy, trading-timeframes, types-of-trading-charts
  updated; old versioned files and archive cleaned up

Co-Authored-By: Claude Sonnet 4.6 <noreply@anthropic.com>
</commit_message>
<xml_diff>
--- a/data/output/lessons/trading-timeframes/lesson_trading-timeframes_EN_outline.docx
+++ b/data/output/lessons/trading-timeframes/lesson_trading-timeframes_EN_outline.docx
@@ -95,6 +95,30 @@
           <w:p>
             <w:pPr/>
             <w:r>
+              <w:t>Czech Title</w:t>
+            </w:r>
+          </w:p>
+        </w:tc>
+        <w:tc>
+          <w:tcPr>
+            <w:tcW w:type="dxa" w:w="4320"/>
+          </w:tcPr>
+          <w:p>
+            <w:pPr/>
+            <w:r>
+              <w:t>Volba casovych ramcu pro ruzne styly obchodovani</w:t>
+            </w:r>
+          </w:p>
+        </w:tc>
+      </w:tr>
+      <w:tr>
+        <w:tc>
+          <w:tcPr>
+            <w:tcW w:type="dxa" w:w="4320"/>
+          </w:tcPr>
+          <w:p>
+            <w:pPr/>
+            <w:r>
               <w:t>Slug</w:t>
             </w:r>
           </w:p>
@@ -119,6 +143,30 @@
           <w:p>
             <w:pPr/>
             <w:r>
+              <w:t>Lokace</w:t>
+            </w:r>
+          </w:p>
+        </w:tc>
+        <w:tc>
+          <w:tcPr>
+            <w:tcW w:type="dxa" w:w="4320"/>
+          </w:tcPr>
+          <w:p>
+            <w:pPr/>
+            <w:r>
+              <w:t>2.1.3.</w:t>
+            </w:r>
+          </w:p>
+        </w:tc>
+      </w:tr>
+      <w:tr>
+        <w:tc>
+          <w:tcPr>
+            <w:tcW w:type="dxa" w:w="4320"/>
+          </w:tcPr>
+          <w:p>
+            <w:pPr/>
+            <w:r>
               <w:t>Part</w:t>
             </w:r>
           </w:p>
@@ -130,7 +178,7 @@
           <w:p>
             <w:pPr/>
             <w:r>
-              <w:t>Part 2 — Trading Analysis</w:t>
+              <w:t>Part 2: Trading Analysis</w:t>
             </w:r>
           </w:p>
         </w:tc>
@@ -154,7 +202,7 @@
           <w:p>
             <w:pPr/>
             <w:r>
-              <w:t>Technical Analysis (proposed — new lesson)</w:t>
+              <w:t>2.1. Graf a timeframe</w:t>
             </w:r>
           </w:p>
         </w:tc>
@@ -178,7 +226,7 @@
           <w:p>
             <w:pPr/>
             <w:r>
-              <w:t>Between Types of Charts and Multiple Timeframe Analysis</w:t>
+              <w:t>Kapitola 3 of 5 in module</w:t>
             </w:r>
           </w:p>
         </w:tc>
@@ -202,7 +250,7 @@
           <w:p>
             <w:pPr/>
             <w:r>
-              <w:t>BEGINNER — foundational concept, no prior TA knowledge required</w:t>
+              <w:t>BEGINNER: foundational concept, no prior TA knowledge required beyond chart basics</w:t>
             </w:r>
           </w:p>
         </w:tc>
@@ -226,13 +274,37 @@
           <w:p>
             <w:pPr/>
             <w:r>
-              <w:t>2,000–2,500 words (competitors avg ~2,000; topic needs 4 styles + framework + FTMO)</w:t>
+              <w:t>1,800-2,200 words (competitors avg ~2,000; narrower scope than v1 outline)</w:t>
             </w:r>
           </w:p>
         </w:tc>
       </w:tr>
     </w:tbl>
     <w:p/>
+    <w:p>
+      <w:pPr>
+        <w:pStyle w:val="Heading2"/>
+      </w:pPr>
+      <w:r>
+        <w:t>Prerequisites</w:t>
+      </w:r>
+    </w:p>
+    <w:p>
+      <w:pPr>
+        <w:pStyle w:val="ListBullet"/>
+      </w:pPr>
+      <w:r>
+        <w:t>Types of Trading Charts: reader must understand what a chart displays</w:t>
+      </w:r>
+    </w:p>
+    <w:p>
+      <w:pPr>
+        <w:pStyle w:val="ListBullet"/>
+      </w:pPr>
+      <w:r>
+        <w:t>Japanese Candlesticks: each candle = one timeframe unit</w:t>
+      </w:r>
+    </w:p>
     <w:p>
       <w:pPr>
         <w:pStyle w:val="Heading2"/>
@@ -246,7 +318,7 @@
         <w:pStyle w:val="ListBullet"/>
       </w:pPr>
       <w:r>
-        <w:t>No competitor connects timeframes to prop trading / FTMO Challenge (daily loss limits, time pressure, evaluation period)</w:t>
+        <w:t>FTMO-specific timeframe implications: daily loss limit, max drawdown, min trading days, 1-Step vs 2-Step differences</w:t>
       </w:r>
     </w:p>
     <w:p>
@@ -254,7 +326,7 @@
         <w:pStyle w:val="ListBullet"/>
       </w:pPr>
       <w:r>
-        <w:t>Decision framework (process, not list) — competitors say "scalping = 1min" but don't teach HOW to decide</w:t>
+        <w:t>Single decision-framework table: personality + style + timeframe + risk profile</w:t>
       </w:r>
     </w:p>
     <w:p>
@@ -262,7 +334,7 @@
         <w:pStyle w:val="ListBullet"/>
       </w:pPr>
       <w:r>
-        <w:t>Risk/position sizing per timeframe — wider TF = wider stops = smaller position size</w:t>
+        <w:t>Risk management per timeframe: stop-loss sizing changes across timeframes</w:t>
       </w:r>
     </w:p>
     <w:p>
@@ -270,7 +342,7 @@
         <w:pStyle w:val="ListBullet"/>
       </w:pPr>
       <w:r>
-        <w:t>Lifestyle/personality fit deeper than competitors (screen time, job compatibility, psychological profile)</w:t>
+        <w:t>Instrument-type awareness: volatility profile affects timeframe choice [expert note b]</w:t>
       </w:r>
     </w:p>
     <w:p>
@@ -278,7 +350,7 @@
         <w:pStyle w:val="ListBullet"/>
       </w:pPr>
       <w:r>
-        <w:t>Excluded: Multi-TF analysis deep dive (separate lesson), specific indicators per TF, platform instructions</w:t>
+        <w:t>Excluded: deep MTA strategies (separate lesson 2.1.4.), indicator settings per TF, platform instructions</w:t>
       </w:r>
     </w:p>
     <w:p>
@@ -286,7 +358,7 @@
         <w:pStyle w:val="Heading2"/>
       </w:pPr>
       <w:r>
-        <w:t>Keywords — Headings</w:t>
+        <w:t>Keywords: Headings</w:t>
       </w:r>
     </w:p>
     <w:tbl>
@@ -455,7 +527,7 @@
           <w:p>
             <w:pPr/>
             <w:r>
-              <w:t>H2</w:t>
+              <w:t>H3 (Day Trading)</w:t>
             </w:r>
           </w:p>
         </w:tc>
@@ -469,6 +541,52 @@
             <w:pPr/>
             <w:r>
               <w:t>3</w:t>
+            </w:r>
+          </w:p>
+        </w:tc>
+        <w:tc>
+          <w:tcPr>
+            <w:tcW w:type="dxa" w:w="2160"/>
+          </w:tcPr>
+          <w:p>
+            <w:pPr/>
+            <w:r>
+              <w:t>best time frame to trade forex</w:t>
+            </w:r>
+          </w:p>
+        </w:tc>
+        <w:tc>
+          <w:tcPr>
+            <w:tcW w:type="dxa" w:w="2160"/>
+          </w:tcPr>
+          <w:p>
+            <w:pPr/>
+            <w:r>
+              <w:t>200</w:t>
+            </w:r>
+          </w:p>
+        </w:tc>
+        <w:tc>
+          <w:tcPr>
+            <w:tcW w:type="dxa" w:w="2160"/>
+          </w:tcPr>
+          <w:p>
+            <w:pPr/>
+            <w:r>
+              <w:t>H2 (How to Choose)</w:t>
+            </w:r>
+          </w:p>
+        </w:tc>
+      </w:tr>
+      <w:tr>
+        <w:tc>
+          <w:tcPr>
+            <w:tcW w:type="dxa" w:w="2160"/>
+          </w:tcPr>
+          <w:p>
+            <w:pPr/>
+            <w:r>
+              <w:t>4</w:t>
             </w:r>
           </w:p>
         </w:tc>
@@ -501,7 +619,7 @@
           <w:p>
             <w:pPr/>
             <w:r>
-              <w:t>H2</w:t>
+              <w:t>H3 (Swing Trading)</w:t>
             </w:r>
           </w:p>
         </w:tc>
@@ -514,7 +632,7 @@
           <w:p>
             <w:pPr/>
             <w:r>
-              <w:t>4</w:t>
+              <w:t>5</w:t>
             </w:r>
           </w:p>
         </w:tc>
@@ -525,7 +643,7 @@
           <w:p>
             <w:pPr/>
             <w:r>
-              <w:t>best time frame to trade forex for beginners</w:t>
+              <w:t>multiple time frame analysis</w:t>
             </w:r>
           </w:p>
         </w:tc>
@@ -547,7 +665,7 @@
           <w:p>
             <w:pPr/>
             <w:r>
-              <w:t>H2</w:t>
+              <w:t>H2 (MTA section)</w:t>
             </w:r>
           </w:p>
         </w:tc>
@@ -560,7 +678,7 @@
           <w:p>
             <w:pPr/>
             <w:r>
-              <w:t>—</w:t>
+              <w:t>-</w:t>
             </w:r>
           </w:p>
         </w:tc>
@@ -571,7 +689,7 @@
           <w:p>
             <w:pPr/>
             <w:r>
-              <w:t>remaining 18 kw</w:t>
+              <w:t>remaining 17 kw</w:t>
             </w:r>
           </w:p>
         </w:tc>
@@ -582,7 +700,7 @@
           <w:p>
             <w:pPr/>
             <w:r>
-              <w:t>—</w:t>
+              <w:t>-</w:t>
             </w:r>
           </w:p>
         </w:tc>
@@ -613,7 +731,7 @@
         <w:pStyle w:val="Heading1"/>
       </w:pPr>
       <w:r>
-        <w:t>Trading Time Frames: How to Choose the Right One for Your Style</w:t>
+        <w:t>Trading Timeframes: How to Choose the Right One for Your Trading Style</w:t>
       </w:r>
     </w:p>
     <w:p>
@@ -625,7 +743,7 @@
         <w:t xml:space="preserve">Key point: </w:t>
       </w:r>
       <w:r>
-        <w:t>Timeframe selection is a strategic decision that shapes everything — from how often you trade to how you manage risk.</w:t>
+        <w:t>Timeframe selection determines trade frequency, risk per trade, and time commitment. It must match your trading style and align with your lifestyle.</w:t>
       </w:r>
     </w:p>
     <w:p>
@@ -633,7 +751,7 @@
         <w:pStyle w:val="Heading2"/>
       </w:pPr>
       <w:r>
-        <w:t>What Is a Timeframe in Trading?</w:t>
+        <w:t>What Is a Trading Timeframe?</w:t>
       </w:r>
     </w:p>
     <w:p>
@@ -651,7 +769,7 @@
         <w:pStyle w:val="ListBullet"/>
       </w:pPr>
       <w:r>
-        <w:t>Definition: period each candlestick/bar represents</w:t>
+        <w:t>Definition: the time period each candlestick or bar represents</w:t>
       </w:r>
     </w:p>
     <w:p>
@@ -659,7 +777,7 @@
         <w:pStyle w:val="ListBullet"/>
       </w:pPr>
       <w:r>
-        <w:t>Range: from 1-minute to monthly</w:t>
+        <w:t>Same market, same data: timeframe changes the resolution (zoom level analogy)</w:t>
       </w:r>
     </w:p>
     <w:p>
@@ -667,7 +785,7 @@
         <w:pStyle w:val="ListBullet"/>
       </w:pPr>
       <w:r>
-        <w:t>Same market, different perspectives</w:t>
+        <w:t>Three categories: short-term (M1-M15), medium-term (M30-H4), long-term (D1-MN)</w:t>
       </w:r>
     </w:p>
     <w:p>
@@ -675,12 +793,128 @@
         <w:pStyle w:val="ListBullet"/>
       </w:pPr>
       <w:r>
-        <w:t>Timeframe ≠ holding period (clarify common confusion)</w:t>
+        <w:t>Higher TF = smoother trends, fewer signals, larger stops; lower TF = more noise, tighter stops, more signals</w:t>
+      </w:r>
+    </w:p>
+    <w:p>
+      <w:pPr>
+        <w:pStyle w:val="ListBullet"/>
+      </w:pPr>
+      <w:r>
+        <w:t>Brief mention: non-time-based chart alternatives exist (tick, Renko, range charts) with link to Types of Trading Charts lesson [expert note a]</w:t>
       </w:r>
     </w:p>
     <w:p>
       <w:r>
-        <w:t>Table: Timeframe categories (short / medium / long) with examples</w:t>
+        <w:t>Table: Timeframe Categories</w:t>
+      </w:r>
+    </w:p>
+    <w:tbl>
+      <w:tblPr>
+        <w:tblStyle w:val="TableGrid"/>
+        <w:tblW w:type="auto" w:w="0"/>
+        <w:jc w:val="left"/>
+        <w:tblLook w:firstColumn="1" w:firstRow="1" w:lastColumn="0" w:lastRow="0" w:noHBand="0" w:noVBand="1" w:val="04A0"/>
+      </w:tblPr>
+      <w:tblGrid>
+        <w:gridCol w:w="1728"/>
+        <w:gridCol w:w="1728"/>
+        <w:gridCol w:w="1728"/>
+        <w:gridCol w:w="1728"/>
+        <w:gridCol w:w="1728"/>
+      </w:tblGrid>
+      <w:tr>
+        <w:tc>
+          <w:tcPr>
+            <w:tcW w:type="dxa" w:w="1728"/>
+            <w:shd w:val="clear" w:color="auto" w:fill="123A83"/>
+          </w:tcPr>
+          <w:p>
+            <w:pPr/>
+            <w:r>
+              <w:rPr>
+                <w:b/>
+                <w:color w:val="FFFFFF"/>
+              </w:rPr>
+              <w:t>Category</w:t>
+            </w:r>
+          </w:p>
+        </w:tc>
+        <w:tc>
+          <w:tcPr>
+            <w:tcW w:type="dxa" w:w="1728"/>
+            <w:shd w:val="clear" w:color="auto" w:fill="123A83"/>
+          </w:tcPr>
+          <w:p>
+            <w:pPr/>
+            <w:r>
+              <w:rPr>
+                <w:b/>
+                <w:color w:val="FFFFFF"/>
+              </w:rPr>
+              <w:t>Chart Intervals</w:t>
+            </w:r>
+          </w:p>
+        </w:tc>
+        <w:tc>
+          <w:tcPr>
+            <w:tcW w:type="dxa" w:w="1728"/>
+            <w:shd w:val="clear" w:color="auto" w:fill="123A83"/>
+          </w:tcPr>
+          <w:p>
+            <w:pPr/>
+            <w:r>
+              <w:rPr>
+                <w:b/>
+                <w:color w:val="FFFFFF"/>
+              </w:rPr>
+              <w:t>Typical Holding Time</w:t>
+            </w:r>
+          </w:p>
+        </w:tc>
+        <w:tc>
+          <w:tcPr>
+            <w:tcW w:type="dxa" w:w="1728"/>
+            <w:shd w:val="clear" w:color="auto" w:fill="123A83"/>
+          </w:tcPr>
+          <w:p>
+            <w:pPr/>
+            <w:r>
+              <w:rPr>
+                <w:b/>
+                <w:color w:val="FFFFFF"/>
+              </w:rPr>
+              <w:t>Signal Frequency</w:t>
+            </w:r>
+          </w:p>
+        </w:tc>
+        <w:tc>
+          <w:tcPr>
+            <w:tcW w:type="dxa" w:w="1728"/>
+            <w:shd w:val="clear" w:color="auto" w:fill="123A83"/>
+          </w:tcPr>
+          <w:p>
+            <w:pPr/>
+            <w:r>
+              <w:rPr>
+                <w:b/>
+                <w:color w:val="FFFFFF"/>
+              </w:rPr>
+              <w:t>Noise Level</w:t>
+            </w:r>
+          </w:p>
+        </w:tc>
+      </w:tr>
+    </w:tbl>
+    <w:p/>
+    <w:p>
+      <w:r>
+        <w:t>Note: instrument type also affects behaviour within each category (forex pairs vs indices vs commodities have different volatility profiles) [expert note b]</w:t>
+      </w:r>
+    </w:p>
+    <w:p>
+      <w:r>
+        <w:t>Podtema 2.1.3.1. (Hierarchie timeframu) covered here: the three-category hierarchy and the relationship between timeframe resolution and signal quality.</w:t>
       </w:r>
     </w:p>
     <w:p>
@@ -688,7 +922,7 @@
         <w:pStyle w:val="Heading2"/>
       </w:pPr>
       <w:r>
-        <w:t>Trading Styles and Their Timeframes</w:t>
+        <w:t>Four Trading Styles and Their Timeframes</w:t>
       </w:r>
     </w:p>
     <w:p>
@@ -700,7 +934,7 @@
         <w:t xml:space="preserve">Key point: </w:t>
       </w:r>
       <w:r>
-        <w:t>Each style has a natural timeframe range. Match first, refine later.</w:t>
+        <w:t>Each trading style has a natural timeframe range. The style defines the timeframe, not the other way around.</w:t>
       </w:r>
     </w:p>
     <w:p>
@@ -708,7 +942,7 @@
         <w:pStyle w:val="Heading3"/>
       </w:pPr>
       <w:r>
-        <w:t>Scalping</w:t>
+        <w:t>Scalping (M1-M15)</w:t>
       </w:r>
     </w:p>
     <w:p>
@@ -716,7 +950,7 @@
         <w:pStyle w:val="ListBullet"/>
       </w:pPr>
       <w:r>
-        <w:t>1-min to 15-min charts</w:t>
+        <w:t>Holding time: seconds to minutes</w:t>
       </w:r>
     </w:p>
     <w:p>
@@ -724,7 +958,7 @@
         <w:pStyle w:val="ListBullet"/>
       </w:pPr>
       <w:r>
-        <w:t>Dozens of trades per day, seconds-to-minutes holding</w:t>
+        <w:t>Charts: M1, M5, M15</w:t>
       </w:r>
     </w:p>
     <w:p>
@@ -732,7 +966,7 @@
         <w:pStyle w:val="ListBullet"/>
       </w:pPr>
       <w:r>
-        <w:t>Requires: constant screen time, fast execution, low spreads</w:t>
+        <w:t>Requirements: full-time screen attention, fast execution, tight spreads</w:t>
       </w:r>
     </w:p>
     <w:p>
@@ -740,26 +974,12 @@
         <w:pStyle w:val="ListBullet"/>
       </w:pPr>
       <w:r>
-        <w:t>Risk: highest noise, most false signals</w:t>
+        <w:t>Risk profile: many small trades, tight stops (5-15 pips), high frequency</w:t>
       </w:r>
     </w:p>
     <w:p>
-      <w:pPr>
-        <w:spacing w:before="120" w:after="120"/>
-        <w:ind w:left="432"/>
-      </w:pPr>
       <w:r>
-        <w:rPr>
-          <w:b/>
-          <w:color w:val="0781FE"/>
-        </w:rPr>
-        <w:t xml:space="preserve">Warning: </w:t>
-      </w:r>
-      <w:r>
-        <w:rPr>
-          <w:color w:val="1A1A2E"/>
-        </w:rPr>
-        <w:t>scalping demands full-time attention and fast decision-making</w:t>
+        <w:t>Callout: Warning: Scalping demands full-time attention and rapid decision-making. It is one of the most challenging styles for beginners.</w:t>
       </w:r>
     </w:p>
     <w:p>
@@ -767,7 +987,7 @@
         <w:pStyle w:val="Heading3"/>
       </w:pPr>
       <w:r>
-        <w:t>Day Trading</w:t>
+        <w:t>Day Trading (M15-H4)</w:t>
       </w:r>
     </w:p>
     <w:p>
@@ -796,7 +1016,7 @@
         <w:pStyle w:val="ListBullet"/>
       </w:pPr>
       <w:r>
-        <w:t>5-min to 1-hour charts</w:t>
+        <w:t>Holding time: minutes to hours, all positions closed before the end of the trading day</w:t>
       </w:r>
     </w:p>
     <w:p>
@@ -804,7 +1024,7 @@
         <w:pStyle w:val="ListBullet"/>
       </w:pPr>
       <w:r>
-        <w:t>All positions closed by end of session</w:t>
+        <w:t>Charts: M15 for entries, H1 for bias, H4 for context</w:t>
       </w:r>
     </w:p>
     <w:p>
@@ -812,7 +1032,7 @@
         <w:pStyle w:val="ListBullet"/>
       </w:pPr>
       <w:r>
-        <w:t>Typical: 15min for structure, 5min for entries, 1H for bias</w:t>
+        <w:t>Requirements: 2-6 hours of focused screen time (can be less with defined setups)</w:t>
       </w:r>
     </w:p>
     <w:p>
@@ -820,7 +1040,7 @@
         <w:pStyle w:val="ListBullet"/>
       </w:pPr>
       <w:r>
-        <w:t>Risk: intraday volatility, overtrading temptation</w:t>
+        <w:t>Risk profile: moderate frequency (2-8 trades/day), stops 15-50 pips</w:t>
       </w:r>
     </w:p>
     <w:p>
@@ -828,7 +1048,7 @@
         <w:pStyle w:val="Heading3"/>
       </w:pPr>
       <w:r>
-        <w:t>Swing Trading</w:t>
+        <w:t>Swing Trading (H4-D1)</w:t>
       </w:r>
     </w:p>
     <w:p>
@@ -857,7 +1077,7 @@
         <w:pStyle w:val="ListBullet"/>
       </w:pPr>
       <w:r>
-        <w:t>4-hour to daily charts</w:t>
+        <w:t>Holding time: days to weeks</w:t>
       </w:r>
     </w:p>
     <w:p>
@@ -865,7 +1085,7 @@
         <w:pStyle w:val="ListBullet"/>
       </w:pPr>
       <w:r>
-        <w:t>Holding period: days to weeks</w:t>
+        <w:t>Charts: H4 for entries, D1 for trend direction</w:t>
       </w:r>
     </w:p>
     <w:p>
@@ -873,7 +1093,7 @@
         <w:pStyle w:val="ListBullet"/>
       </w:pPr>
       <w:r>
-        <w:t>Less screen time, larger stop losses, smaller position sizes</w:t>
+        <w:t>Requirements: monitoring overall trends and news without full-time focus, combined with 30-60 minutes of dedicated screen time daily</w:t>
       </w:r>
     </w:p>
     <w:p>
@@ -881,7 +1101,15 @@
         <w:pStyle w:val="ListBullet"/>
       </w:pPr>
       <w:r>
-        <w:t>Best starting point for part-time traders</w:t>
+        <w:t>Risk profile: fewer trades (2-5/week), wider stops (50-150 pips)</w:t>
+      </w:r>
+    </w:p>
+    <w:p>
+      <w:pPr>
+        <w:pStyle w:val="ListBullet"/>
+      </w:pPr>
+      <w:r>
+        <w:t>Most recommended starting style for beginners: less noise, clearer signals</w:t>
       </w:r>
     </w:p>
     <w:p>
@@ -889,7 +1117,7 @@
         <w:pStyle w:val="Heading3"/>
       </w:pPr>
       <w:r>
-        <w:t>Position Trading</w:t>
+        <w:t>Position Trading (D1-MN)</w:t>
       </w:r>
     </w:p>
     <w:p>
@@ -897,7 +1125,7 @@
         <w:pStyle w:val="ListBullet"/>
       </w:pPr>
       <w:r>
-        <w:t>Daily to monthly charts</w:t>
+        <w:t>Holding time: weeks to months</w:t>
       </w:r>
     </w:p>
     <w:p>
@@ -905,7 +1133,7 @@
         <w:pStyle w:val="ListBullet"/>
       </w:pPr>
       <w:r>
-        <w:t>Holding period: weeks to months</w:t>
+        <w:t>Charts: D1, W1, MN</w:t>
       </w:r>
     </w:p>
     <w:p>
@@ -913,7 +1141,7 @@
         <w:pStyle w:val="ListBullet"/>
       </w:pPr>
       <w:r>
-        <w:t>Fundamental analysis plays bigger role</w:t>
+        <w:t>Requirements: weekly review sufficient</w:t>
       </w:r>
     </w:p>
     <w:p>
@@ -921,14 +1149,134 @@
         <w:pStyle w:val="ListBullet"/>
       </w:pPr>
       <w:r>
-        <w:t>Widest stops, smallest positions relative to account</w:t>
+        <w:t>Risk profile: lowest frequency, widest stops (100-500+ pips), swap costs become a factor</w:t>
       </w:r>
     </w:p>
     <w:p>
       <w:r>
-        <w:t>Table: Comparison — Style | Timeframe | Trades/day | Screen time | Stop size</w:t>
+        <w:t>Callout: Tip: No trading style is superior. The best style is the one you can execute consistently.</w:t>
       </w:r>
     </w:p>
+    <w:p>
+      <w:r>
+        <w:t>Table: Trading Style Comparison</w:t>
+      </w:r>
+    </w:p>
+    <w:tbl>
+      <w:tblPr>
+        <w:tblStyle w:val="TableGrid"/>
+        <w:tblW w:type="auto" w:w="0"/>
+        <w:jc w:val="left"/>
+        <w:tblLook w:firstColumn="1" w:firstRow="1" w:lastColumn="0" w:lastRow="0" w:noHBand="0" w:noVBand="1" w:val="04A0"/>
+      </w:tblPr>
+      <w:tblGrid>
+        <w:gridCol w:w="1440"/>
+        <w:gridCol w:w="1440"/>
+        <w:gridCol w:w="1440"/>
+        <w:gridCol w:w="1440"/>
+        <w:gridCol w:w="1440"/>
+        <w:gridCol w:w="1440"/>
+      </w:tblGrid>
+      <w:tr>
+        <w:tc>
+          <w:tcPr>
+            <w:tcW w:type="dxa" w:w="1440"/>
+            <w:shd w:val="clear" w:color="auto" w:fill="123A83"/>
+          </w:tcPr>
+          <w:p>
+            <w:pPr/>
+            <w:r>
+              <w:rPr>
+                <w:b/>
+                <w:color w:val="FFFFFF"/>
+              </w:rPr>
+              <w:t>Style</w:t>
+            </w:r>
+          </w:p>
+        </w:tc>
+        <w:tc>
+          <w:tcPr>
+            <w:tcW w:type="dxa" w:w="1440"/>
+            <w:shd w:val="clear" w:color="auto" w:fill="123A83"/>
+          </w:tcPr>
+          <w:p>
+            <w:pPr/>
+            <w:r>
+              <w:rPr>
+                <w:b/>
+                <w:color w:val="FFFFFF"/>
+              </w:rPr>
+              <w:t>Timeframes</w:t>
+            </w:r>
+          </w:p>
+        </w:tc>
+        <w:tc>
+          <w:tcPr>
+            <w:tcW w:type="dxa" w:w="1440"/>
+            <w:shd w:val="clear" w:color="auto" w:fill="123A83"/>
+          </w:tcPr>
+          <w:p>
+            <w:pPr/>
+            <w:r>
+              <w:rPr>
+                <w:b/>
+                <w:color w:val="FFFFFF"/>
+              </w:rPr>
+              <w:t>Holding Period</w:t>
+            </w:r>
+          </w:p>
+        </w:tc>
+        <w:tc>
+          <w:tcPr>
+            <w:tcW w:type="dxa" w:w="1440"/>
+            <w:shd w:val="clear" w:color="auto" w:fill="123A83"/>
+          </w:tcPr>
+          <w:p>
+            <w:pPr/>
+            <w:r>
+              <w:rPr>
+                <w:b/>
+                <w:color w:val="FFFFFF"/>
+              </w:rPr>
+              <w:t>Trades/Week</w:t>
+            </w:r>
+          </w:p>
+        </w:tc>
+        <w:tc>
+          <w:tcPr>
+            <w:tcW w:type="dxa" w:w="1440"/>
+            <w:shd w:val="clear" w:color="auto" w:fill="123A83"/>
+          </w:tcPr>
+          <w:p>
+            <w:pPr/>
+            <w:r>
+              <w:rPr>
+                <w:b/>
+                <w:color w:val="FFFFFF"/>
+              </w:rPr>
+              <w:t>Stop-Loss Range</w:t>
+            </w:r>
+          </w:p>
+        </w:tc>
+        <w:tc>
+          <w:tcPr>
+            <w:tcW w:type="dxa" w:w="1440"/>
+            <w:shd w:val="clear" w:color="auto" w:fill="123A83"/>
+          </w:tcPr>
+          <w:p>
+            <w:pPr/>
+            <w:r>
+              <w:rPr>
+                <w:b/>
+                <w:color w:val="FFFFFF"/>
+              </w:rPr>
+              <w:t>Screen Time</w:t>
+            </w:r>
+          </w:p>
+        </w:tc>
+      </w:tr>
+    </w:tbl>
+    <w:p/>
     <w:p>
       <w:pPr>
         <w:pStyle w:val="Heading2"/>
@@ -955,7 +1303,7 @@
           <w:color w:val="555555"/>
           <w:sz w:val="20"/>
         </w:rPr>
-        <w:t>best time frame to trade forex for beginners</w:t>
+        <w:t>best time frame to trade forex</w:t>
       </w:r>
     </w:p>
     <w:p>
@@ -967,7 +1315,7 @@
         <w:t xml:space="preserve">Key point: </w:t>
       </w:r>
       <w:r>
-        <w:t>Decision framework — a process, not a list.</w:t>
+        <w:t>Decision framework, a process based on five factors.</w:t>
       </w:r>
     </w:p>
     <w:p>
@@ -975,7 +1323,7 @@
         <w:pStyle w:val="ListBullet"/>
       </w:pPr>
       <w:r>
-        <w:t>Factor 1: Available time (full-time vs. part-time vs. occasional)</w:t>
+        <w:t>Factor 1: Time availability: hours per day for active trading</w:t>
       </w:r>
     </w:p>
     <w:p>
@@ -983,7 +1331,7 @@
         <w:pStyle w:val="ListBullet"/>
       </w:pPr>
       <w:r>
-        <w:t>Factor 2: Personality (patience, stress tolerance, decision speed)</w:t>
+        <w:t>Factor 2: Personality and stress tolerance: fast decisions vs patience</w:t>
       </w:r>
     </w:p>
     <w:p>
@@ -991,7 +1339,7 @@
         <w:pStyle w:val="ListBullet"/>
       </w:pPr>
       <w:r>
-        <w:t>Factor 3: Risk tolerance (wider TF = wider stops = different sizing)</w:t>
+        <w:t>Factor 3: Risk tolerance: frequent small losses vs infrequent larger drawdowns</w:t>
       </w:r>
     </w:p>
     <w:p>
@@ -999,34 +1347,131 @@
         <w:pStyle w:val="ListBullet"/>
       </w:pPr>
       <w:r>
-        <w:t>Factor 4: Experience level — beginners start with daily, move down</w:t>
+        <w:t>Factor 4: Experience level: beginners benefit from higher timeframes (D1, H4)</w:t>
       </w:r>
     </w:p>
     <w:p>
       <w:pPr>
-        <w:spacing w:before="120" w:after="120"/>
-        <w:ind w:left="432"/>
+        <w:pStyle w:val="ListBullet"/>
       </w:pPr>
       <w:r>
-        <w:rPr>
-          <w:b/>
-          <w:color w:val="0781FE"/>
-        </w:rPr>
-        <w:t xml:space="preserve">Tip: </w:t>
+        <w:t>Factor 5: Market and instrument: different volatility profiles suit different timeframes [expert note b]</w:t>
       </w:r>
+    </w:p>
+    <w:p>
       <w:r>
-        <w:rPr>
-          <w:color w:val="1A1A2E"/>
-        </w:rPr>
-        <w:t>Start with the daily chart. It filters noise and builds discipline.</w:t>
+        <w:t>Table: Decision Framework</w:t>
+      </w:r>
+    </w:p>
+    <w:tbl>
+      <w:tblPr>
+        <w:tblStyle w:val="TableGrid"/>
+        <w:tblW w:type="auto" w:w="0"/>
+        <w:jc w:val="left"/>
+        <w:tblLook w:firstColumn="1" w:firstRow="1" w:lastColumn="0" w:lastRow="0" w:noHBand="0" w:noVBand="1" w:val="04A0"/>
+      </w:tblPr>
+      <w:tblGrid>
+        <w:gridCol w:w="1728"/>
+        <w:gridCol w:w="1728"/>
+        <w:gridCol w:w="1728"/>
+        <w:gridCol w:w="1728"/>
+        <w:gridCol w:w="1728"/>
+      </w:tblGrid>
+      <w:tr>
+        <w:tc>
+          <w:tcPr>
+            <w:tcW w:type="dxa" w:w="1728"/>
+            <w:shd w:val="clear" w:color="auto" w:fill="123A83"/>
+          </w:tcPr>
+          <w:p>
+            <w:pPr/>
+            <w:r>
+              <w:rPr>
+                <w:b/>
+                <w:color w:val="FFFFFF"/>
+              </w:rPr>
+              <w:t>Factor</w:t>
+            </w:r>
+          </w:p>
+        </w:tc>
+        <w:tc>
+          <w:tcPr>
+            <w:tcW w:type="dxa" w:w="1728"/>
+            <w:shd w:val="clear" w:color="auto" w:fill="123A83"/>
+          </w:tcPr>
+          <w:p>
+            <w:pPr/>
+            <w:r>
+              <w:rPr>
+                <w:b/>
+                <w:color w:val="FFFFFF"/>
+              </w:rPr>
+              <w:t>Scalping</w:t>
+            </w:r>
+          </w:p>
+        </w:tc>
+        <w:tc>
+          <w:tcPr>
+            <w:tcW w:type="dxa" w:w="1728"/>
+            <w:shd w:val="clear" w:color="auto" w:fill="123A83"/>
+          </w:tcPr>
+          <w:p>
+            <w:pPr/>
+            <w:r>
+              <w:rPr>
+                <w:b/>
+                <w:color w:val="FFFFFF"/>
+              </w:rPr>
+              <w:t>Day Trading</w:t>
+            </w:r>
+          </w:p>
+        </w:tc>
+        <w:tc>
+          <w:tcPr>
+            <w:tcW w:type="dxa" w:w="1728"/>
+            <w:shd w:val="clear" w:color="auto" w:fill="123A83"/>
+          </w:tcPr>
+          <w:p>
+            <w:pPr/>
+            <w:r>
+              <w:rPr>
+                <w:b/>
+                <w:color w:val="FFFFFF"/>
+              </w:rPr>
+              <w:t>Swing Trading</w:t>
+            </w:r>
+          </w:p>
+        </w:tc>
+        <w:tc>
+          <w:tcPr>
+            <w:tcW w:type="dxa" w:w="1728"/>
+            <w:shd w:val="clear" w:color="auto" w:fill="123A83"/>
+          </w:tcPr>
+          <w:p>
+            <w:pPr/>
+            <w:r>
+              <w:rPr>
+                <w:b/>
+                <w:color w:val="FFFFFF"/>
+              </w:rPr>
+              <w:t>Position Trading</w:t>
+            </w:r>
+          </w:p>
+        </w:tc>
+      </w:tr>
+    </w:tbl>
+    <w:p/>
+    <w:p>
+      <w:r>
+        <w:t>Callout: Important: Start with a higher timeframe. Stepping down from D1 to H4 as you gain confidence is much easier than recovering from the noise and overtrading on M5 as a beginner.</w:t>
       </w:r>
     </w:p>
     <w:p>
       <w:pPr>
-        <w:pStyle w:val="Heading2"/>
+        <w:pStyle w:val="Heading3"/>
       </w:pPr>
       <w:r>
-        <w:t>Timeframes and Risk Management</w:t>
+        <w:t>FTMO-Specific Considerations</w:t>
       </w:r>
     </w:p>
     <w:p>
@@ -1038,7 +1483,7 @@
         <w:t xml:space="preserve">Key point: </w:t>
       </w:r>
       <w:r>
-        <w:t>Timeframe directly affects stop-loss distance and position size.</w:t>
+        <w:t>FTMO Trading Objectives add concrete constraints to timeframe selection.</w:t>
       </w:r>
     </w:p>
     <w:p>
@@ -1046,7 +1491,7 @@
         <w:pStyle w:val="ListBullet"/>
       </w:pPr>
       <w:r>
-        <w:t>Shorter TF = tighter stops = larger position possible BUT more noise</w:t>
+        <w:t>Daily loss limit (5% for 2-Step Challenge): scalpers and day traders must calculate maximum number of concurrent positions to stay within limits. Note: the 1-Step Challenge uses different thresholds, so rules vary by programme type [expert notes d, e]</w:t>
       </w:r>
     </w:p>
     <w:p>
@@ -1054,7 +1499,7 @@
         <w:pStyle w:val="ListBullet"/>
       </w:pPr>
       <w:r>
-        <w:t>Longer TF = wider stops = smaller position BUT cleaner signals</w:t>
+        <w:t>Maximum drawdown (10%): wider stops on higher timeframes mean fewer concurrent positions allowed</w:t>
       </w:r>
     </w:p>
     <w:p>
@@ -1062,7 +1507,7 @@
         <w:pStyle w:val="ListBullet"/>
       </w:pPr>
       <w:r>
-        <w:t>Position sizing formula connection (link to Risk Management lesson)</w:t>
+        <w:t>Minimum trading days: position trading with very few trades may not meet the requirement</w:t>
       </w:r>
     </w:p>
     <w:p>
@@ -1070,26 +1515,17 @@
         <w:pStyle w:val="ListBullet"/>
       </w:pPr>
       <w:r>
-        <w:t>Example: same account, same risk %, different TF → different lot size</w:t>
+        <w:t>Day trading and swing trading tend to be common approaches among funded traders, though no single style guarantees success [expert notes f, g, softened claim]</w:t>
       </w:r>
     </w:p>
     <w:p>
-      <w:pPr>
-        <w:spacing w:before="120" w:after="120"/>
-        <w:ind w:left="432"/>
-      </w:pPr>
       <w:r>
-        <w:rPr>
-          <w:b/>
-          <w:color w:val="0781FE"/>
-        </w:rPr>
-        <w:t xml:space="preserve">Important: </w:t>
+        <w:t>Callout: Warning: Your timeframe choice directly affects your risk per trade. Calculate how your stop-loss distance fits within FTMO Trading Objectives before committing to a style.</w:t>
       </w:r>
+    </w:p>
+    <w:p>
       <w:r>
-        <w:rPr>
-          <w:color w:val="1A1A2E"/>
-        </w:rPr>
-        <w:t>Your timeframe choice changes your position size. Never increase risk % to compensate for wider stops.</w:t>
+        <w:t>Callout: Tip: These risk parameters are not just for FTMO evaluations. Setting similar boundaries on a personal broker account builds the same discipline and protects capital in the same way. [expert note c]</w:t>
       </w:r>
     </w:p>
     <w:p>
@@ -1097,7 +1533,28 @@
         <w:pStyle w:val="Heading2"/>
       </w:pPr>
       <w:r>
-        <w:t>Timeframes in the FTMO Challenge</w:t>
+        <w:t>Introduction to Multiple Timeframe Analysis</w:t>
+      </w:r>
+    </w:p>
+    <w:p>
+      <w:pPr>
+        <w:spacing w:before="40"/>
+      </w:pPr>
+      <w:r>
+        <w:rPr>
+          <w:b/>
+          <w:color w:val="555555"/>
+          <w:sz w:val="20"/>
+        </w:rPr>
+        <w:t xml:space="preserve">Target keyword: </w:t>
+      </w:r>
+      <w:r>
+        <w:rPr>
+          <w:i/>
+          <w:color w:val="555555"/>
+          <w:sz w:val="20"/>
+        </w:rPr>
+        <w:t>multiple time frame analysis</w:t>
       </w:r>
     </w:p>
     <w:p>
@@ -1109,7 +1566,7 @@
         <w:t xml:space="preserve">Key point: </w:t>
       </w:r>
       <w:r>
-        <w:t>FTMO-specific considerations that competitors don't cover.</w:t>
+        <w:t>Using more than one timeframe improves trade quality. This section introduces the concept; the full lesson follows in 2.1.4.</w:t>
       </w:r>
     </w:p>
     <w:p>
@@ -1117,7 +1574,7 @@
         <w:pStyle w:val="ListBullet"/>
       </w:pPr>
       <w:r>
-        <w:t>Daily loss limit (5%) — shorter TFs accumulate losses faster</w:t>
+        <w:t>Core concept: higher TF for direction, lower TF for entry timing</w:t>
       </w:r>
     </w:p>
     <w:p>
@@ -1125,7 +1582,7 @@
         <w:pStyle w:val="ListBullet"/>
       </w:pPr>
       <w:r>
-        <w:t>Maximum loss limit (10%) — position sizing must account for TF</w:t>
+        <w:t>Standard combinations: D1 + H4 (swing), H4 + M30 (intraday), M30 + M5 (scalping)</w:t>
       </w:r>
     </w:p>
     <w:p>
@@ -1133,7 +1590,7 @@
         <w:pStyle w:val="ListBullet"/>
       </w:pPr>
       <w:r>
-        <w:t>Time pressure (evaluation period) — balance between opportunity and discipline</w:t>
+        <w:t>Rule of thumb: execution TF x 4-6 = context TF</w:t>
       </w:r>
     </w:p>
     <w:p>
@@ -1141,26 +1598,12 @@
         <w:pStyle w:val="ListBullet"/>
       </w:pPr>
       <w:r>
-        <w:t>Most successful FTMO traders use 1H–Daily range</w:t>
+        <w:t>Brief example: D1 uptrend, H4 pullback to support, enter long on H4</w:t>
       </w:r>
     </w:p>
     <w:p>
-      <w:pPr>
-        <w:spacing w:before="120" w:after="120"/>
-        <w:ind w:left="432"/>
-      </w:pPr>
       <w:r>
-        <w:rPr>
-          <w:b/>
-          <w:color w:val="0781FE"/>
-        </w:rPr>
-        <w:t xml:space="preserve">Tip: </w:t>
-      </w:r>
-      <w:r>
-        <w:rPr>
-          <w:color w:val="1A1A2E"/>
-        </w:rPr>
-        <w:t>In the FTMO Challenge, consistency matters more than frequency. A swing trading approach on the 4H/Daily often outperforms aggressive scalping.</w:t>
+        <w:t>Callout: Note: This is an introduction only. For full strategies and implementation, see the Multiple Timeframe Analysis lesson (2.1.4.).</w:t>
       </w:r>
     </w:p>
     <w:p>
@@ -1168,7 +1611,7 @@
         <w:pStyle w:val="Heading2"/>
       </w:pPr>
       <w:r>
-        <w:t>Common Mistakes</w:t>
+        <w:t>Common Mistakes in Timeframe Selection</w:t>
       </w:r>
     </w:p>
     <w:p>
@@ -1176,7 +1619,7 @@
         <w:pStyle w:val="ListBullet"/>
       </w:pPr>
       <w:r>
-        <w:t>Switching timeframes mid-trade (chasing confirmation)</w:t>
+        <w:t>Not defining a timeframe plan before entering a trade: leads to inconsistent analysis and emotional decisions [replaces expert-flagged item h]</w:t>
       </w:r>
     </w:p>
     <w:p>
@@ -1184,7 +1627,7 @@
         <w:pStyle w:val="ListBullet"/>
       </w:pPr>
       <w:r>
-        <w:t>Using too short a TF for experience level</w:t>
+        <w:t>Using too short a timeframe as a beginner: more noise, more emotional pressure, more false signals</w:t>
       </w:r>
     </w:p>
     <w:p>
@@ -1192,7 +1635,7 @@
         <w:pStyle w:val="ListBullet"/>
       </w:pPr>
       <w:r>
-        <w:t>Ignoring higher TF context</w:t>
+        <w:t>Ignoring the higher timeframe trend: trading against the D1 direction on M15 reduces probability</w:t>
       </w:r>
     </w:p>
     <w:p>
@@ -1200,26 +1643,12 @@
         <w:pStyle w:val="ListBullet"/>
       </w:pPr>
       <w:r>
-        <w:t>Changing TF after a losing streak instead of reviewing strategy</w:t>
+        <w:t>Choosing a timeframe that does not fit your schedule: leads to missed exits, overtrading, or abandoning trades prematurely</w:t>
       </w:r>
     </w:p>
     <w:p>
-      <w:pPr>
-        <w:spacing w:before="120" w:after="120"/>
-        <w:ind w:left="432"/>
-      </w:pPr>
       <w:r>
-        <w:rPr>
-          <w:b/>
-          <w:color w:val="0781FE"/>
-        </w:rPr>
-        <w:t xml:space="preserve">Keep in Mind: </w:t>
-      </w:r>
-      <w:r>
-        <w:rPr>
-          <w:color w:val="1A1A2E"/>
-        </w:rPr>
-        <w:t>The urge to drop to a lower timeframe after losses is emotional, not analytical.</w:t>
+        <w:t>Callout: Keep in Mind: The urge to drop to a lower timeframe after a losing streak is emotional, not analytical. If your strategy was built on H4, switching to M15 does not fix the problem.</w:t>
       </w:r>
     </w:p>
     <w:p>
@@ -1227,38 +1656,22 @@
         <w:pStyle w:val="Heading2"/>
       </w:pPr>
       <w:r>
-        <w:t>Conclusion</w:t>
+        <w:t>Next Steps</w:t>
       </w:r>
     </w:p>
     <w:p>
       <w:r>
-        <w:t>Synthesis — timeframe is a tool, not a strategy.</w:t>
+        <w:t>Summary: 3-4 bullet takeaways (key principles from the lesson)</w:t>
       </w:r>
     </w:p>
     <w:p>
       <w:r>
-        <w:t>Table: Final comparison (Style | TF | Screen time | Stop size | Best for)</w:t>
-      </w:r>
-    </w:p>
-    <w:p>
-      <w:pPr>
-        <w:pStyle w:val="Heading2"/>
-      </w:pPr>
-      <w:r>
-        <w:t>Key Takeaways (section)</w:t>
+        <w:t>Action step: Pick one trading style, set up the corresponding timeframe combination, and practise on a demo account or the FTMO Free Trial for at least two weeks before evaluating results.</w:t>
       </w:r>
     </w:p>
     <w:p>
       <w:r>
-        <w:t>5–6 bullet recap</w:t>
-      </w:r>
-    </w:p>
-    <w:p>
-      <w:pPr>
-        <w:pStyle w:val="Heading2"/>
-      </w:pPr>
-      <w:r>
-        <w:t>Next Steps (section)</w:t>
+        <w:t>Internal links:</w:t>
       </w:r>
     </w:p>
     <w:p>
@@ -1266,7 +1679,7 @@
         <w:pStyle w:val="ListBullet"/>
       </w:pPr>
       <w:r>
-        <w:t>Multiple Timeframe Analysis</w:t>
+        <w:t>Multiple Timeframe Analysis (2.1.4.)</w:t>
       </w:r>
     </w:p>
     <w:p>
@@ -1274,7 +1687,7 @@
         <w:pStyle w:val="ListBullet"/>
       </w:pPr>
       <w:r>
-        <w:t>Risk Management</w:t>
+        <w:t>Types of Trading Charts (2.1.1.)</w:t>
       </w:r>
     </w:p>
     <w:p>
@@ -1282,7 +1695,15 @@
         <w:pStyle w:val="ListBullet"/>
       </w:pPr>
       <w:r>
-        <w:t>Types of Trading Charts</w:t>
+        <w:t>Market Environment: Ranges vs Trends (2.2.4.)</w:t>
+      </w:r>
+    </w:p>
+    <w:p>
+      <w:pPr>
+        <w:pStyle w:val="ListBullet"/>
+      </w:pPr>
+      <w:r>
+        <w:t>Trading Hours and Sessions (2.1.5.)</w:t>
       </w:r>
     </w:p>
     <w:p>
@@ -1408,7 +1829,64 @@
           <w:p>
             <w:pPr/>
             <w:r>
-              <w:t>Japanese Candlesticks</w:t>
+              <w:t>types of trading charts</w:t>
+            </w:r>
+          </w:p>
+        </w:tc>
+        <w:tc>
+          <w:tcPr>
+            <w:tcW w:type="dxa" w:w="1728"/>
+          </w:tcPr>
+          <w:p>
+            <w:pPr/>
+            <w:r>
+              <w:t>Types of Trading Charts (2.1.1.)</w:t>
+            </w:r>
+          </w:p>
+        </w:tc>
+        <w:tc>
+          <w:tcPr>
+            <w:tcW w:type="dxa" w:w="1728"/>
+          </w:tcPr>
+          <w:p>
+            <w:pPr/>
+            <w:r>
+              <w:t>types-of-trading-charts</w:t>
+            </w:r>
+          </w:p>
+        </w:tc>
+        <w:tc>
+          <w:tcPr>
+            <w:tcW w:type="dxa" w:w="1728"/>
+          </w:tcPr>
+          <w:p>
+            <w:pPr/>
+            <w:r>
+              <w:t>What Is a TF + Next Steps</w:t>
+            </w:r>
+          </w:p>
+        </w:tc>
+      </w:tr>
+      <w:tr>
+        <w:tc>
+          <w:tcPr>
+            <w:tcW w:type="dxa" w:w="1728"/>
+          </w:tcPr>
+          <w:p>
+            <w:pPr/>
+            <w:r>
+              <w:t>2</w:t>
+            </w:r>
+          </w:p>
+        </w:tc>
+        <w:tc>
+          <w:tcPr>
+            <w:tcW w:type="dxa" w:w="1728"/>
+          </w:tcPr>
+          <w:p>
+            <w:pPr/>
+            <w:r>
+              <w:t>Japanese candlesticks</w:t>
             </w:r>
           </w:p>
         </w:tc>
@@ -1441,64 +1919,7 @@
           <w:p>
             <w:pPr/>
             <w:r>
-              <w:t>What Is a Timeframe</w:t>
-            </w:r>
-          </w:p>
-        </w:tc>
-      </w:tr>
-      <w:tr>
-        <w:tc>
-          <w:tcPr>
-            <w:tcW w:type="dxa" w:w="1728"/>
-          </w:tcPr>
-          <w:p>
-            <w:pPr/>
-            <w:r>
-              <w:t>2</w:t>
-            </w:r>
-          </w:p>
-        </w:tc>
-        <w:tc>
-          <w:tcPr>
-            <w:tcW w:type="dxa" w:w="1728"/>
-          </w:tcPr>
-          <w:p>
-            <w:pPr/>
-            <w:r>
-              <w:t>Types of Trading Charts</w:t>
-            </w:r>
-          </w:p>
-        </w:tc>
-        <w:tc>
-          <w:tcPr>
-            <w:tcW w:type="dxa" w:w="1728"/>
-          </w:tcPr>
-          <w:p>
-            <w:pPr/>
-            <w:r>
-              <w:t>Types of Trading Charts</w:t>
-            </w:r>
-          </w:p>
-        </w:tc>
-        <w:tc>
-          <w:tcPr>
-            <w:tcW w:type="dxa" w:w="1728"/>
-          </w:tcPr>
-          <w:p>
-            <w:pPr/>
-            <w:r>
-              <w:t>types-of-trading-charts</w:t>
-            </w:r>
-          </w:p>
-        </w:tc>
-        <w:tc>
-          <w:tcPr>
-            <w:tcW w:type="dxa" w:w="1728"/>
-          </w:tcPr>
-          <w:p>
-            <w:pPr/>
-            <w:r>
-              <w:t>What Is a Timeframe</w:t>
+              <w:t>What Is a TF</w:t>
             </w:r>
           </w:p>
         </w:tc>
@@ -1522,7 +1943,7 @@
           <w:p>
             <w:pPr/>
             <w:r>
-              <w:t>risk and money management</w:t>
+              <w:t>trading hours and sessions</w:t>
             </w:r>
           </w:p>
         </w:tc>
@@ -1533,7 +1954,7 @@
           <w:p>
             <w:pPr/>
             <w:r>
-              <w:t>Risk Management</w:t>
+              <w:t>Trading Hours and Sessions (2.1.5.)</w:t>
             </w:r>
           </w:p>
         </w:tc>
@@ -1544,7 +1965,7 @@
           <w:p>
             <w:pPr/>
             <w:r>
-              <w:t>risk-and-money-management</w:t>
+              <w:t>forex-trading-hours-and-sessions</w:t>
             </w:r>
           </w:p>
         </w:tc>
@@ -1555,7 +1976,7 @@
           <w:p>
             <w:pPr/>
             <w:r>
-              <w:t>Timeframes and Risk Management</w:t>
+              <w:t>How to Choose</w:t>
             </w:r>
           </w:p>
         </w:tc>
@@ -1590,7 +2011,7 @@
           <w:p>
             <w:pPr/>
             <w:r>
-              <w:t>Multiple Timeframe Analysis</w:t>
+              <w:t>Multiple Timeframe Analysis (2.1.4.)</w:t>
             </w:r>
           </w:p>
         </w:tc>
@@ -1612,7 +2033,7 @@
           <w:p>
             <w:pPr/>
             <w:r>
-              <w:t>Next Steps</w:t>
+              <w:t>MTA section + Next Steps</w:t>
             </w:r>
           </w:p>
         </w:tc>
@@ -1636,7 +2057,7 @@
           <w:p>
             <w:pPr/>
             <w:r>
-              <w:t>Trading Hours and Sessions</w:t>
+              <w:t>market environment</w:t>
             </w:r>
           </w:p>
         </w:tc>
@@ -1647,7 +2068,7 @@
           <w:p>
             <w:pPr/>
             <w:r>
-              <w:t>Trading Hours and Sessions</w:t>
+              <w:t>Market Environment (2.2.4.)</w:t>
             </w:r>
           </w:p>
         </w:tc>
@@ -1658,7 +2079,7 @@
           <w:p>
             <w:pPr/>
             <w:r>
-              <w:t>forex-trading-hours-and-sessions</w:t>
+              <w:t>market-environment-range-vs-trend</w:t>
             </w:r>
           </w:p>
         </w:tc>
@@ -1669,7 +2090,7 @@
           <w:p>
             <w:pPr/>
             <w:r>
-              <w:t>Day Trading section</w:t>
+              <w:t>How to Choose + Next Steps</w:t>
             </w:r>
           </w:p>
         </w:tc>
@@ -1689,7 +2110,7 @@
         <w:pStyle w:val="ListBullet"/>
       </w:pPr>
       <w:r>
-        <w:t>Structure: Definition → Styles → Framework → Risk → FTMO → Mistakes → Conclusion — logical, each builds on previous</w:t>
+        <w:t>Structure follows logical progression: define, classify, choose, combine, avoid mistakes</w:t>
       </w:r>
     </w:p>
     <w:p>
@@ -1697,7 +2118,7 @@
         <w:pStyle w:val="ListBullet"/>
       </w:pPr>
       <w:r>
-        <w:t>Classification: BEGINNER — all terms defined, no assumed TA knowledge</w:t>
+        <w:t>BEGINNER classification correct: all terms defined, no assumed TA knowledge beyond chart basics</w:t>
       </w:r>
     </w:p>
     <w:p>
@@ -1705,7 +2126,7 @@
         <w:pStyle w:val="ListBullet"/>
       </w:pPr>
       <w:r>
-        <w:t>Gaps: All 4 major styles covered, decision framework present, risk connection present, FTMO context present</w:t>
+        <w:t>All 4 trading styles covered at appropriate depth with specific pip ranges</w:t>
       </w:r>
     </w:p>
     <w:p>
@@ -1713,7 +2134,39 @@
         <w:pStyle w:val="ListBullet"/>
       </w:pPr>
       <w:r>
-        <w:t>Out of scope: Multi-TF detail (separate lesson), indicators, platforms — correctly excluded</w:t>
+        <w:t>FTMO-specific section provides genuine differentiation with 1-Step/2-Step distinction</w:t>
+      </w:r>
+    </w:p>
+    <w:p>
+      <w:pPr>
+        <w:pStyle w:val="ListBullet"/>
+      </w:pPr>
+      <w:r>
+        <w:t>Podtema 2.1.3.1. (Hierarchie timeframu) integrated into "What Is a Trading Timeframe?" section</w:t>
+      </w:r>
+    </w:p>
+    <w:p>
+      <w:pPr>
+        <w:pStyle w:val="ListBullet"/>
+      </w:pPr>
+      <w:r>
+        <w:t>Podtema 2.1.3.2. (Vyber timeframu podle stylu) cancelled in Google Sheet; its content covered by "How to Choose" section</w:t>
+      </w:r>
+    </w:p>
+    <w:p>
+      <w:pPr>
+        <w:pStyle w:val="ListBullet"/>
+      </w:pPr>
+      <w:r>
+        <w:t>All 8 expert comments addressed (see changelog below)</w:t>
+      </w:r>
+    </w:p>
+    <w:p>
+      <w:pPr>
+        <w:pStyle w:val="ListBullet"/>
+      </w:pPr>
+      <w:r>
+        <w:t>Didactic sequence correct: concept, application, decision framework, MTA bridge, common errors</w:t>
       </w:r>
     </w:p>
     <w:p>
@@ -1728,6 +2181,358 @@
       </w:r>
       <w:r/>
     </w:p>
+    <w:p>
+      <w:pPr>
+        <w:pStyle w:val="Heading2"/>
+      </w:pPr>
+      <w:r>
+        <w:t>Expert Comments: Resolution Log</w:t>
+      </w:r>
+    </w:p>
+    <w:tbl>
+      <w:tblPr>
+        <w:tblStyle w:val="TableGrid"/>
+        <w:tblW w:type="auto" w:w="0"/>
+        <w:jc w:val="left"/>
+        <w:tblLook w:firstColumn="1" w:firstRow="1" w:lastColumn="0" w:lastRow="0" w:noHBand="0" w:noVBand="1" w:val="04A0"/>
+      </w:tblPr>
+      <w:tblGrid>
+        <w:gridCol w:w="2880"/>
+        <w:gridCol w:w="2880"/>
+        <w:gridCol w:w="2880"/>
+      </w:tblGrid>
+      <w:tr>
+        <w:tc>
+          <w:tcPr>
+            <w:tcW w:type="dxa" w:w="2880"/>
+            <w:shd w:val="clear" w:color="auto" w:fill="123A83"/>
+          </w:tcPr>
+          <w:p>
+            <w:pPr/>
+            <w:r>
+              <w:rPr>
+                <w:b/>
+                <w:color w:val="FFFFFF"/>
+              </w:rPr>
+              <w:t>Comment</w:t>
+            </w:r>
+          </w:p>
+        </w:tc>
+        <w:tc>
+          <w:tcPr>
+            <w:tcW w:type="dxa" w:w="2880"/>
+            <w:shd w:val="clear" w:color="auto" w:fill="123A83"/>
+          </w:tcPr>
+          <w:p>
+            <w:pPr/>
+            <w:r>
+              <w:rPr>
+                <w:b/>
+                <w:color w:val="FFFFFF"/>
+              </w:rPr>
+              <w:t>Expert Feedback</w:t>
+            </w:r>
+          </w:p>
+        </w:tc>
+        <w:tc>
+          <w:tcPr>
+            <w:tcW w:type="dxa" w:w="2880"/>
+            <w:shd w:val="clear" w:color="auto" w:fill="123A83"/>
+          </w:tcPr>
+          <w:p>
+            <w:pPr/>
+            <w:r>
+              <w:rPr>
+                <w:b/>
+                <w:color w:val="FFFFFF"/>
+              </w:rPr>
+              <w:t>Resolution</w:t>
+            </w:r>
+          </w:p>
+        </w:tc>
+      </w:tr>
+      <w:tr>
+        <w:tc>
+          <w:tcPr>
+            <w:tcW w:type="dxa" w:w="2880"/>
+          </w:tcPr>
+          <w:p>
+            <w:pPr/>
+            <w:r>
+              <w:t>[a]</w:t>
+            </w:r>
+          </w:p>
+        </w:tc>
+        <w:tc>
+          <w:tcPr>
+            <w:tcW w:type="dxa" w:w="2880"/>
+          </w:tcPr>
+          <w:p>
+            <w:pPr/>
+            <w:r>
+              <w:t>Check alternatives to time-based charts, link to Types of Trading Charts</w:t>
+            </w:r>
+          </w:p>
+        </w:tc>
+        <w:tc>
+          <w:tcPr>
+            <w:tcW w:type="dxa" w:w="2880"/>
+          </w:tcPr>
+          <w:p>
+            <w:pPr/>
+            <w:r>
+              <w:t>Added mention of tick/Renko/range charts in "What Is a TF" + link</w:t>
+            </w:r>
+          </w:p>
+        </w:tc>
+      </w:tr>
+      <w:tr>
+        <w:tc>
+          <w:tcPr>
+            <w:tcW w:type="dxa" w:w="2880"/>
+          </w:tcPr>
+          <w:p>
+            <w:pPr/>
+            <w:r>
+              <w:t>[b]</w:t>
+            </w:r>
+          </w:p>
+        </w:tc>
+        <w:tc>
+          <w:tcPr>
+            <w:tcW w:type="dxa" w:w="2880"/>
+          </w:tcPr>
+          <w:p>
+            <w:pPr/>
+            <w:r>
+              <w:t>Instrument type plays a significant role</w:t>
+            </w:r>
+          </w:p>
+        </w:tc>
+        <w:tc>
+          <w:tcPr>
+            <w:tcW w:type="dxa" w:w="2880"/>
+          </w:tcPr>
+          <w:p>
+            <w:pPr/>
+            <w:r>
+              <w:t>Added as Factor 5 in "How to Choose" + note in TF Categories table</w:t>
+            </w:r>
+          </w:p>
+        </w:tc>
+      </w:tr>
+      <w:tr>
+        <w:tc>
+          <w:tcPr>
+            <w:tcW w:type="dxa" w:w="2880"/>
+          </w:tcPr>
+          <w:p>
+            <w:pPr/>
+            <w:r>
+              <w:t>[c]</w:t>
+            </w:r>
+          </w:p>
+        </w:tc>
+        <w:tc>
+          <w:tcPr>
+            <w:tcW w:type="dxa" w:w="2880"/>
+          </w:tcPr>
+          <w:p>
+            <w:pPr/>
+            <w:r>
+              <w:t>Emphasise personal account risk parameters mirroring FTMO standards</w:t>
+            </w:r>
+          </w:p>
+        </w:tc>
+        <w:tc>
+          <w:tcPr>
+            <w:tcW w:type="dxa" w:w="2880"/>
+          </w:tcPr>
+          <w:p>
+            <w:pPr/>
+            <w:r>
+              <w:t>Added dedicated Tip callout in FTMO section</w:t>
+            </w:r>
+          </w:p>
+        </w:tc>
+      </w:tr>
+      <w:tr>
+        <w:tc>
+          <w:tcPr>
+            <w:tcW w:type="dxa" w:w="2880"/>
+          </w:tcPr>
+          <w:p>
+            <w:pPr/>
+            <w:r>
+              <w:t>[d]</w:t>
+            </w:r>
+          </w:p>
+        </w:tc>
+        <w:tc>
+          <w:tcPr>
+            <w:tcW w:type="dxa" w:w="2880"/>
+          </w:tcPr>
+          <w:p>
+            <w:pPr/>
+            <w:r>
+              <w:t>1-Step vs 2-Step have different rules for 5% daily loss</w:t>
+            </w:r>
+          </w:p>
+        </w:tc>
+        <w:tc>
+          <w:tcPr>
+            <w:tcW w:type="dxa" w:w="2880"/>
+          </w:tcPr>
+          <w:p>
+            <w:pPr/>
+            <w:r>
+              <w:t>Clarified that 5% applies to 2-Step; 1-Step uses different thresholds</w:t>
+            </w:r>
+          </w:p>
+        </w:tc>
+      </w:tr>
+      <w:tr>
+        <w:tc>
+          <w:tcPr>
+            <w:tcW w:type="dxa" w:w="2880"/>
+          </w:tcPr>
+          <w:p>
+            <w:pPr/>
+            <w:r>
+              <w:t>[e]</w:t>
+            </w:r>
+          </w:p>
+        </w:tc>
+        <w:tc>
+          <w:tcPr>
+            <w:tcW w:type="dxa" w:w="2880"/>
+          </w:tcPr>
+          <w:p>
+            <w:pPr/>
+            <w:r>
+              <w:t>1-Step variant not previously reflected</w:t>
+            </w:r>
+          </w:p>
+        </w:tc>
+        <w:tc>
+          <w:tcPr>
+            <w:tcW w:type="dxa" w:w="2880"/>
+          </w:tcPr>
+          <w:p>
+            <w:pPr/>
+            <w:r>
+              <w:t>Addressed together with [d]</w:t>
+            </w:r>
+          </w:p>
+        </w:tc>
+      </w:tr>
+      <w:tr>
+        <w:tc>
+          <w:tcPr>
+            <w:tcW w:type="dxa" w:w="2880"/>
+          </w:tcPr>
+          <w:p>
+            <w:pPr/>
+            <w:r>
+              <w:t>[f]</w:t>
+            </w:r>
+          </w:p>
+        </w:tc>
+        <w:tc>
+          <w:tcPr>
+            <w:tcW w:type="dxa" w:w="2880"/>
+          </w:tcPr>
+          <w:p>
+            <w:pPr/>
+            <w:r>
+              <w:t>Verification needed before asserting day/swing prevalence</w:t>
+            </w:r>
+          </w:p>
+        </w:tc>
+        <w:tc>
+          <w:tcPr>
+            <w:tcW w:type="dxa" w:w="2880"/>
+          </w:tcPr>
+          <w:p>
+            <w:pPr/>
+            <w:r>
+              <w:t>Softened to "tend to be common approaches" without absolute claim</w:t>
+            </w:r>
+          </w:p>
+        </w:tc>
+      </w:tr>
+      <w:tr>
+        <w:tc>
+          <w:tcPr>
+            <w:tcW w:type="dxa" w:w="2880"/>
+          </w:tcPr>
+          <w:p>
+            <w:pPr/>
+            <w:r>
+              <w:t>[g]</w:t>
+            </w:r>
+          </w:p>
+        </w:tc>
+        <w:tc>
+          <w:tcPr>
+            <w:tcW w:type="dxa" w:w="2880"/>
+          </w:tcPr>
+          <w:p>
+            <w:pPr/>
+            <w:r>
+              <w:t>Related to [f]: make more general</w:t>
+            </w:r>
+          </w:p>
+        </w:tc>
+        <w:tc>
+          <w:tcPr>
+            <w:tcW w:type="dxa" w:w="2880"/>
+          </w:tcPr>
+          <w:p>
+            <w:pPr/>
+            <w:r>
+              <w:t>Addressed together with [f]</w:t>
+            </w:r>
+          </w:p>
+        </w:tc>
+      </w:tr>
+      <w:tr>
+        <w:tc>
+          <w:tcPr>
+            <w:tcW w:type="dxa" w:w="2880"/>
+          </w:tcPr>
+          <w:p>
+            <w:pPr/>
+            <w:r>
+              <w:t>[h]</w:t>
+            </w:r>
+          </w:p>
+        </w:tc>
+        <w:tc>
+          <w:tcPr>
+            <w:tcW w:type="dxa" w:w="2880"/>
+          </w:tcPr>
+          <w:p>
+            <w:pPr/>
+            <w:r>
+              <w:t>"Switching TF mid-trade" not entirely accurate</w:t>
+            </w:r>
+          </w:p>
+        </w:tc>
+        <w:tc>
+          <w:tcPr>
+            <w:tcW w:type="dxa" w:w="2880"/>
+          </w:tcPr>
+          <w:p>
+            <w:pPr/>
+            <w:r>
+              <w:t>Replaced with "Not defining a TF plan before entering a trade"</w:t>
+            </w:r>
+          </w:p>
+        </w:tc>
+      </w:tr>
+    </w:tbl>
+    <w:p/>
     <w:sectPr>
       <w:pgSz w:w="12240" w:h="15840"/>
       <w:pgMar w:top="1440" w:right="1800" w:bottom="1440" w:left="1800" w:header="720" w:footer="720" w:gutter="0"/>

</xml_diff>